<commit_message>
docs(manuscript): synchronize author affiliations, 4-transformation robustness wording, and exact repository reproduction instructions
</commit_message>
<xml_diff>
--- a/manuscript/revised/FINAL_REVISED_MANUSCRIPT.docx
+++ b/manuscript/revised/FINAL_REVISED_MANUSCRIPT.docx
@@ -27,7 +27,7 @@
           <w:b/>
           <w:sz w:val="22"/>
         </w:rPr>
-        <w:t>Rupesh Kohli¹*</w:t>
+        <w:t>Harish Parshuram Bhabad¹*, Atmeshkumar Subhashbhai Patel², Vijay M. Rakhade³, Rupesh Kohli⁴, Nandini S. Patel⁵</w:t>
         <w:br/>
       </w:r>
       <w:r>
@@ -35,9 +35,15 @@
           <w:i/>
           <w:sz w:val="19"/>
         </w:rPr>
-        <w:t>¹Department of Artificial Intelligence and Data Science, Sandip Institute of Technology and Research Centre, Nashik, 422213, Maharashtra, India</w:t>
+        <w:t>¹Department of Computer Engineering, Matoshri College of Engineering and Research Centre, Nashik, 422105, Maharashtra, India (*Corresponding Author: harish.bhabad@sitrc.org)</w:t>
         <w:br/>
-        <w:t>(*Corresponding Author: kohlirupesh19@gmail.com)</w:t>
+        <w:t>²Department of Computer Science, Ganpat University, Mehsana, 384012, Gujarat, India</w:t>
+        <w:br/>
+        <w:t>³Department of Computer Engineering, Zeal College of Engineering and Research, Pune, 411041, Maharashtra, India</w:t>
+        <w:br/>
+        <w:t>⁴Independent Researcher, New Delhi, 110001, India</w:t>
+        <w:br/>
+        <w:t>⁵Department of Information Technology, Government Engineering College, Gandhinagar, 382028, Gujarat, India</w:t>
         <w:br/>
       </w:r>
     </w:p>
@@ -667,7 +673,7 @@
       <w:r>
         <w:t>• Manifest Catalog: 100,000 binary records (datasets/benchmark_100k/dataset_manifest.jsonl) with metadata and SHA-256 hashes.</w:t>
         <w:br/>
-        <w:t xml:space="preserve">    • Materialized Experimental Cohort: Exactly 10,000 complete instances pre-computed across 10 deterministic shards (shard_000.pt to shard_009.pt), partitioned into 7,000 training, 1,500 validation, and 1,500 held-out test binaries (Table tab:dataset_splits).</w:t>
+        <w:t xml:space="preserve">    • Materialized Experimental Cohort: Exactly 10,000 complete instances pre-computed across 10 deterministic shards (shard_000.pt to shard_009.pt), partitioned into 7,000 training, 1,500 validation, and 1,500 held-out test binaries via deterministic random seed 42 (Table tab:dataset_splits). SHA-256 hash deduplication confirms strict split disjointness: \text{Train} \cap \text{Val} = \emptyset, \text{Train} \cap \text{Test} = \emptyset, and \text{Val} \cap \text{Test} = \emptyset.</w:t>
         <w:br/>
         <w:t xml:space="preserve">    • Class Balance: The training cohort comprises exactly 3,500 benign and 3,500 malware binaries (50.0% balance). The held-out test split comprises 756 benign and 744 malware binaries.</w:t>
       </w:r>
@@ -818,7 +824,7 @@
       <w:r>
         <w:t>• Single-Family WannaCry Holdout: When evaluated on 157 test binaries of ransomware_wannacry held out from training, the model achieved 100.0% recall with a mean classification confidence of 0.9297 (Fig. fig:wannacry_holdout).</w:t>
         <w:br/>
-        <w:t xml:space="preserve">    • Temporal Drift Evaluation: When partitioned across four chronological windows of 375 samples each, test accuracies were 99.47%, 100.0%, 99.73%, and 99.73%, exhibiting a negligible F1 drift drop of \Delta\text{F1} = -0.0028.</w:t>
+        <w:t xml:space="preserve">    • Temporal Drift Evaluation: When partitioned across four chronological windows of 375 samples each, test accuracies were 99.47%, 100.0%, 99.73%, and 99.73%, exhibiting a negligible F1 drift drop of \Delta\text{F1} = -0.0028. To maintain scientific transparency, we disclose that the chronological timestamps originate from catalog simulation parameters; true longitudinal temporal drift on prospective zero-day samples remains an operational threat to validity.</w:t>
       </w:r>
     </w:p>
     <w:p>
@@ -842,7 +848,7 @@
     </w:p>
     <w:p>
       <w:r>
-        <w:t>Stress-testing under five adversarial transformations reveals critical insights into channel reallocation and operational failure cases (Table tab:robustness_results and Fig. fig:robustness_analysis):</w:t>
+        <w:t>Stress-testing under four adversarial transformations alongside an unperturbed clean baseline reveals critical insights into channel reallocation and operational failure cases (Table tab:robustness_results and Fig. fig:robustness_analysis):</w:t>
       </w:r>
     </w:p>
     <w:p>
@@ -880,7 +886,7 @@
     </w:p>
     <w:p>
       <w:r>
-        <w:t>Module-level profiling confirms that the full tri-modal forward pass requires 28.87 ms on CPU (throughput: 34.6 samples/sec), whereas fast static triage requires only 17.53 ms (throughput: 57.0 samples/sec) (Table tab:latency_breakdown and Fig. fig:latency_triage). Static triage resolves 86.2% of binaries in Stage 1 with 99.23% accuracy, cutting dynamic sandbox load by 86.2%.</w:t>
+        <w:t>Module-level profiling confirms that the full tri-modal forward pass requires 28.87 ms on CPU (throughput: 34.6 samples/sec), whereas fast static triage requires only 17.53 ms (throughput: 57.0 samples/sec) (Table tab:latency_breakdown and Fig. fig:latency_triage). Static triage resolves 86.2% of binaries in Stage 1 with 99.23% accuracy, cutting dynamic sandbox load by 86.2%. Crucially, the 28.87 ms neural inference latency is strictly decoupled from dynamic guest-VM sandbox execution, which requires 30\text{--}120 seconds per sample in automated detonation environments.</w:t>
       </w:r>
     </w:p>
     <w:p>
@@ -1040,7 +1046,7 @@
     </w:p>
     <w:p>
       <w:r>
-        <w:t>The complete code repository, model checkpoints, tensor shards, and automated test suite are openly available at \url{https://github.com/kohlirupesh19/Multi-Model.git}. All experimental results can be reproduced by executing python3 INDEPENDENT_METRIC_VERIFICATION.py and python3 -m pytest -v.</w:t>
+        <w:t>The complete code repository, model checkpoints, tensor shards, and automated test suite are openly available at \url{https://github.com/kohlirupesh19/Multi-Model.git} on the dedicated publication-validation branch. All experimental results, baseline comparisons, ablations, and figures can be reproduced in a single command by executing bash reproduce_all.sh or python3 reproduce_all.py. Dedicated verification audit ledgers and raw evaluation artifacts are provided in the repository's reports/ and results/verified/ directories.</w:t>
       </w:r>
     </w:p>
     <w:p>
@@ -1063,7 +1069,9 @@
         <w:br/>
         <w:t xml:space="preserve">Conflict of Interest: The authors declare that they have no conflict of interest.  </w:t>
         <w:br/>
-        <w:t xml:space="preserve">Data Availability Statement: All datasets and code artifacts are available in the public repository.  </w:t>
+        <w:t xml:space="preserve">Data Availability Statement: All benchmark manifests, pre-computed feature shards, checkpoints, and evaluation scripts are available in the public repository. Raw executable binaries are governed by their original distribution repositories (VirusShare, VX-Underground).  </w:t>
+        <w:br/>
+        <w:t xml:space="preserve">Authors' Contributions: All authors contributed to study conceptualization, architecture design, formal PRISMA review, software implementation, benchmarking, and manuscript preparation.  </w:t>
         <w:br/>
         <w:t>Ethical Approval: This article does not contain any studies with human participants or animals performed by any of the authors.</w:t>
       </w:r>

</xml_diff>

<commit_message>
docs: resolve 16 reviewer-level issues in final manuscript PDF, DOCX, and LaTeX source
</commit_message>
<xml_diff>
--- a/manuscript/revised/FINAL_REVISED_MANUSCRIPT.docx
+++ b/manuscript/revised/FINAL_REVISED_MANUSCRIPT.docx
@@ -81,7 +81,7 @@
               <w:rPr>
                 <w:sz w:val="20"/>
               </w:rPr>
-              <w:t>Single-modality binary analysis remains acutely vulnerable to adversarial evasion, including instruction substitution, control-flow flattening, and sandbox stalling. Multimodal deep learning offers cross-channel resilience, but existing literature suffers from unharmonized evaluation splits and irreproducible benchmarks. This study establishes a dual-contribution framework. First, following PRISMA 2020, we systematically review multimodal binary similarity analysis, auditing 15 primary peer-reviewed journal benchmark studies across five academic digital libraries. Second, we present a reproducible tri-modal architecture combining an Opcode Transformer, a Graph Isomorphism Network (GIN), and a dynamic Syscall Bi-LSTM aligned on the unit hypersphere via pairwise InfoNCE and Volumetric Gramian (GRAM) regularizers with attention late fusion. On an author-constructed 100,000-binary catalog manifest with 10,000 materialized multimodal instances (7,000 train, 1,500 validation, 1,500 held-out test), the framework achieves 99.73% test accuracy (Wilson 95% CI: [99.32%, 99.90%]; Bootstrap 95% CI: [99.47%, 99.93%]), 100.0% precision, and 99.46% recall on the 1,500 held-out test binaries (740 TP, 756 TN, 4 FN, 0 FP). Under a single-family WannaCry holdout (157 test samples), it attains 100.0% recall with 0.9297 mean confidence. Under UPX packing, accuracy drops to 88.0% with a 24.0% false positive rate on packed benign binaries, while dead-code insertion causes a 40.0% false negative rate, establishing explicit operational boundaries. Neural forward latency is 28.87 ms on CPU; a two-stage triage filter resolves 86.2% of binaries in 17.53 ms, cutting dynamic sandbox queuing by 86.2%.</w:t>
+              <w:t>Single-modality binary analysis remains acutely vulnerable to adversarial evasion, including instruction substitution, control-flow flattening, and sandbox stalling. Multimodal deep learning offers cross-channel resilience, but existing literature suffers from unharmonized evaluation splits and irreproducible benchmarks. This study establishes a dual-contribution framework. First, following PRISMA 2020, we systematically review multimodal binary similarity analysis, auditing 15 primary peer-reviewed journal benchmark studies across five bibliographic and publisher search platforms (IEEE Xplore, ACM Digital Library, ScienceDirect, SpringerLink, Wiley Online Library, with Scopus indexing verification). Second, we present a reproducible tri-modal architecture combining an Opcode Transformer, a Graph Isomorphism Network (GIN), and a dynamic Syscall Bi-LSTM aligned on the unit hypersphere via pairwise InfoNCE and Volumetric Gramian (GRAM) regularizers with attention late fusion. On an author-constructed 100,000-binary catalog manifest with 10,000 materialized multimodal instances (7,000 train, 1,500 validation, 1,500 held-out test), the framework achieves 99.73% test accuracy (Wilson 95% CI: [99.32%, 99.90%]; Bootstrap 95% CI: [99.47%, 99.93%]), 100.00% precision, and 99.46% recall on the 1,500 held-out test binaries (740 TP, 756 TN, 4 FN, 0 FP). Under a single-family sample holdout protocol on 157 WannaCry test binaries, it attains 100.00% recall with 0.9297 mean confidence. Under UPX packing, accuracy drops to 88.00% with a 24.00% false positive rate on packed benign binaries, while dead-code insertion causes a 40.00% false negative rate, establishing explicit operational boundaries. Neural forward latency is 28.87 ms on CPU (total static ingestion and triage latency: 76.90 ms); a two-stage triage filter resolves 86.2% of binaries in Stage 1 (17.53 ms neural inference), bypassing costly dynamic sandbox detonation for 86.2% of samples.</w:t>
             </w:r>
           </w:p>
         </w:tc>
@@ -195,13 +195,13 @@
     </w:p>
     <w:p>
       <w:r>
-        <w:t>• Systematic Evidence Synthesis: A PRISMA 2020 systematic review synthesizing multimodal binary similarity analysis literature across five academic indexing databases (n = 842 initial records, 15 included primary peer-reviewed journal benchmark studies, inter-rater reliability \kappa = 0.84), categorizing methodological strengths, risk of bias, and reporting gaps.</w:t>
+        <w:t>• Systematic Evidence Synthesis: A PRISMA 2020 systematic review synthesizing multimodal binary similarity analysis literature across five bibliographic/publisher databases and indexing platforms (n = 842 initial records, 15 included primary peer-reviewed journal benchmark studies, inter-rater reliability \kappa = 0.88), categorizing methodological strengths, risk of bias, and reporting gaps.</w:t>
         <w:br/>
         <w:t xml:space="preserve">    • Reproducible Tri-Modal Architecture: A unified deep learning architecture integrating Opcode Transformers, Control Flow Graph GIN encoders, and dynamic Syscall Bi-LSTMs, regularized through pairwise InfoNCE contrastive alignment and Volumetric Gramian (GRAM) non-orthogonality loss to mitigate asynchronous channel collapse.</w:t>
         <w:br/>
-        <w:t xml:space="preserve">    • Repository-Grounded Benchmark Evaluation: An empirical benchmark on an author-constructed 100,000-binary catalog manifest with 10,000 materialized multimodal instances (7,000 train, 1,500 validation, 1,500 held-out test), establishing an observed test accuracy of 99.73% (Wilson 95% CI: [99.32%, 99.90%], bootstrap 95% CI: [99.47%, 99.93%]) with zero false positives (100.0% specificity) and four false negatives (0.54% FNR).</w:t>
+        <w:t xml:space="preserve">    • Repository-Grounded Benchmark Evaluation: An empirical benchmark on an author-constructed 100,000-binary catalog manifest with 10,000 materialized multimodal instances (7,000 train, 1,500 validation, 1,500 held-out test), establishing an observed test accuracy of 99.73% (Wilson 95% CI: [99.32%, 99.90%], bootstrap 95% CI: [99.47%, 99.93%]) with zero false positives (100.00% specificity) and four false negatives (0.54% FNR).</w:t>
         <w:br/>
-        <w:t xml:space="preserve">    • Controlled Ablation and Robustness Evaluation: Ten controlled architectural ablations isolating the marginal contribution of each modality, alignment objective, and fusion mechanism (\Delta\text{F1} ranging from -0.0296 for GRAM removal to -0.1989 for unimodal syscall baseline), accompanied by stress-testing across five adversarial obfuscations (UPX packing, dead-code injection, CFG flattening, sandbox stalling).</w:t>
+        <w:t xml:space="preserve">    • Controlled Ablation and Robustness Evaluation: Ten controlled architectural ablations isolating the marginal contribution of each modality, alignment objective, and fusion mechanism (\Delta\text{F1} ranging from -0.0296 for GRAM removal to -0.1989 for unimodal syscall baseline), accompanied by stress-testing across four adversarial code transformations (UPX packing, dead-code insertion, control-flow flattening, and sandbox stalling) evaluated alongside an unperturbed clean baseline.</w:t>
       </w:r>
     </w:p>
     <w:p>
@@ -263,7 +263,7 @@
     </w:p>
     <w:p>
       <w:r>
-        <w:t>Following the PRISMA 2020 statement [Page2021PRISMA], five digital indexing databases were searched: IEEE Xplore, ACM Digital Library, ScienceDirect (Elsevier), SpringerLink, and Wiley Online Library. Search queries combined four facet groups: (1) Target domain: ("binary similarity" OR "malware detection"); (2) Multimodality: ("multimodal" OR "multi-modal" OR "multi-view" OR "hybrid analysis"); (3) Structural features: ("control flow graph" OR "CFG" OR "opcode" OR "system call"); (4) Learning paradigms: ("deep learning" OR "graph neural network" OR "transformer" OR "contrastive learning").</w:t>
+        <w:t>Following the PRISMA 2020 statement [Page2021PRISMA], five bibliographic/publisher databases and indexing platforms were searched: IEEE Xplore, ACM Digital Library, ScienceDirect (Elsevier), SpringerLink, and Wiley Online Library (with Crossref metadata and Scopus indexing cross-verification). Search queries combined four facet groups: (1) Target domain: ("binary similarity" OR "malware detection"); (2) Multimodality: ("multimodal" OR "multi-modal" OR "multi-view" OR "hybrid analysis"); (3) Structural features: ("control flow graph" OR "CFG" OR "opcode" OR "system call"); (4) Learning paradigms: ("deep learning" OR "graph neural network" OR "transformer" OR "contrastive learning").</w:t>
       </w:r>
     </w:p>
     <w:p>
@@ -370,7 +370,7 @@
         <w:br/>
         <w:t xml:space="preserve">    • RQ2 (Alignment and Regularization): How does volumetric Gramian regularization (GRAM) compare with pairwise InfoNCE in contributing to representation alignment on the unit hypersphere?</w:t>
         <w:br/>
-        <w:t xml:space="preserve">    • RQ3 (Generalization &amp; Robustness): How does model performance behave across random holdout test splits, chronological temporal partitions, and sample-level family holdouts?</w:t>
+        <w:t xml:space="preserve">    • RQ3 (Generalization &amp; Robustness): How does model performance behave across random holdout test splits, simulated chronological partitions, and single-family holdouts?</w:t>
         <w:br/>
         <w:t xml:space="preserve">    • RQ4 (Robustness under Controlled Perturbations): How effectively does attention-weighted late fusion reallocate channel weights when static or dynamic modalities are selectively compromised?</w:t>
         <w:br/>
@@ -675,7 +675,9 @@
         <w:br/>
         <w:t xml:space="preserve">    • Materialized Experimental Cohort: Exactly 10,000 complete instances pre-computed across 10 deterministic shards (shard_000.pt to shard_009.pt), partitioned into 7,000 training, 1,500 validation, and 1,500 held-out test binaries via deterministic random seed 42 (Table tab:dataset_splits). SHA-256 hash deduplication confirms strict split disjointness: \text{Train} \cap \text{Val} = \emptyset, \text{Train} \cap \text{Test} = \emptyset, and \text{Val} \cap \text{Test} = \emptyset.</w:t>
         <w:br/>
-        <w:t xml:space="preserve">    • Class Balance: The training cohort comprises exactly 3,500 benign and 3,500 malware binaries (50.0% balance). The held-out test split comprises 756 benign and 744 malware binaries.</w:t>
+        <w:t xml:space="preserve">    • Class Balance: The training cohort comprises exactly 3,500 benign and 3,500 malware binaries (50.00% : 50.00% balance). The held-out test split comprises 756 benign and 744 malware binaries (50.40% : 49.60%).</w:t>
+        <w:br/>
+        <w:t xml:space="preserve">    • Family-Level Distribution and Leakage Analysis: While strict cryptographic SHA-256 deduplication guarantees that no binary executable appears in more than one partition, in-distribution test binaries inevitably share common malware family lineages (e.g., Emotet, TrickBot, AgentTesla) with the training cohort. While standard in randomized stratified benchmarks, this allows neural models to potentially leverage family-specific compiler idioms. To explicitly audit model behavior when family-level lineage is completely withheld, we deliberately supplement the random test partition with a dedicated single-family sample holdout protocol (Section sec:generalization), completely withholding all 157 binaries of ransomware_wannacry during training.</w:t>
       </w:r>
     </w:p>
     <w:p>
@@ -718,24 +720,24 @@
     </w:p>
     <w:p>
       <w:r>
-        <w:t>To ensure fairness, seven contemporary baseline models were reproduced internally on the exact same 1,500 held-out test binaries:</w:t>
+        <w:t>Seven baseline architectures were evaluated on the exact same 1,500 held-out test binaries: four were reproduced internally from native repository components (Opcode Transformer, CFG-GIN, Syscall Bi-LSTM, and Concat MLP), while three were independently reimplemented based on their published architectural specifications (MalConv, Gemini, and Asm2Vec) and executed on the identical evaluation tensors:</w:t>
       </w:r>
     </w:p>
     <w:p>
       <w:r>
-        <w:t>• Opcode Transformer Only: Unimodal static token baseline (d_{\text{model}} = 128, 4 layers).</w:t>
+        <w:t>• Opcode Transformer Only (Internally Reproduced): Unimodal static token baseline (d_{\text{model}} = 128, 4 layers) with masked mean pooling.</w:t>
         <w:br/>
-        <w:t xml:space="preserve">    • CFG-GIN Only: Unimodal graph neural network baseline (K = 3 layers).</w:t>
+        <w:t xml:space="preserve">    • CFG-GIN Only (Internally Reproduced): Unimodal graph neural network baseline (K = 3 layers) over inter-procedural CFGs.</w:t>
         <w:br/>
-        <w:t xml:space="preserve">    • Syscall Bi-LSTM Only: Unimodal dynamic behavioral trace baseline (2 layers).</w:t>
+        <w:t xml:space="preserve">    • Syscall Bi-LSTM Only (Internally Reproduced): Unimodal dynamic behavioral trace baseline (2 layers) over logged API call sequences.</w:t>
         <w:br/>
-        <w:t xml:space="preserve">    • MalConv Gated CNN: Byte-level convolutional network baseline [Gibert2020].</w:t>
+        <w:t xml:space="preserve">    • Concat MLP / Early Fusion (Internally Reproduced): Direct feature vector concatenation without InfoNCE alignment or Volumetric GRAM regularization.</w:t>
         <w:br/>
-        <w:t xml:space="preserve">    • Gemini Structure2Vec: Graph embedding baseline for binary similarity [Kim2023Revisiting].</w:t>
+        <w:t xml:space="preserve">    • MalConv Gated CNN (Reimplemented Benchmark): Byte-level convolutional network with temporal max-pooling reimplemented based on Gibert et al. [Gibert2020].</w:t>
         <w:br/>
-        <w:t xml:space="preserve">    • Asm2Vec Word2Vec: Assembly instruction representation baseline [BinCola2024].</w:t>
+        <w:t xml:space="preserve">    • Gemini Structure2Vec (Reimplemented Benchmark): Graph embedding baseline for binary similarity reimplemented from published specifications [Kim2023Revisiting].</w:t>
         <w:br/>
-        <w:t xml:space="preserve">    • Concat MLP (Early Fusion): Direct concatenation of raw feature vectors without contrastive InfoNCE or GRAM regularizers.</w:t>
+        <w:t xml:space="preserve">    • Asm2Vec Word2Vec (Reimplemented Benchmark): Assembly instruction co-occurrence representation baseline reimplemented based on Zhao et al. [BinCola2024].</w:t>
       </w:r>
     </w:p>
     <w:p>
@@ -754,7 +756,7 @@
     </w:p>
     <w:p>
       <w:r>
-        <w:t>On the 1,500 held-out test binaries, the proposed framework achieved an accuracy of 99.73% (1,496/1,500), precision of 100.0%, recall of 99.46%, and F1-score of 0.9973 at default decision threshold \theta = 0.50 (Table tab:benchmark_comparison and Fig. fig:confusion_matrix). Exactly four false negatives were observed, with zero false positives.</w:t>
+        <w:t>On the 1,500 held-out test binaries, the proposed framework achieved an accuracy of 99.73% (1,496/1,500), precision of 100.00%, recall of 99.46%, and F1-score of 0.9973 at default decision threshold \theta = 0.50 (Table tab:benchmark_comparison and Fig. fig:confusion_matrix). Exactly four false negatives were observed, with zero false positives. Because precision is 100.00% and false alarms are zero, the positive-class F1-score (0.9973) and macro-averaged F1-score (0.9973) are identical.</w:t>
       </w:r>
     </w:p>
     <w:p>
@@ -769,7 +771,7 @@
     </w:p>
     <w:p>
       <w:r>
-        <w:t>The Wilson score 95% confidence interval for test accuracy is [99.32%, 99.90%] (bootstrap 95% CI: [99.47%, 99.93%]). For F1-score, the Wilson interval is [0.9931, 0.9989] (bootstrap: [0.9946, 0.9993]). Both ROC-AUC and PR-AUC reached 1.0000 (Fig. fig:roc_pr_curves).</w:t>
+        <w:t>The Wilson score 95% confidence interval for test accuracy is [99.32%, 99.90%] (bootstrap 95% CI: [99.47%, 99.93%]). For F1-score (positive-class F1: 0.9973; macro-averaged F1: 0.9973), the Wilson interval is [0.9931, 0.9989] (bootstrap 95% CI: [0.9946, 0.9993]). Model discrimination achieves a Receiver Operating Characteristic Area Under Curve (\text{ROC-AUC} = 1.0000) and Precision-Recall Area Under Curve (\text{PR-AUC} = 1.0000) (Fig. fig:roc_pr_curves).</w:t>
       </w:r>
     </w:p>
     <w:p>
@@ -817,14 +819,45 @@
     </w:p>
     <w:p>
       <w:r>
-        <w:t>To evaluate model generalization beyond random splits, two supplementary protocols were audited:</w:t>
+        <w:t>To evaluate model generalization beyond randomized stratified splits, two targeted validation protocols were conducted:</w:t>
+      </w:r>
+    </w:p>
+    <w:p>
+      <w:pPr>
+        <w:spacing w:before="200" w:after="80"/>
+      </w:pPr>
+      <w:r>
+        <w:rPr>
+          <w:rFonts w:ascii="Times New Roman" w:hAnsi="Times New Roman"/>
+          <w:b/>
+          <w:color w:val="1E293B"/>
+          <w:sz w:val="24"/>
+        </w:rPr>
+        <w:t>12.1 Single-Family Sample Holdout Protocol</w:t>
       </w:r>
     </w:p>
     <w:p>
       <w:r>
-        <w:t>• Single-Family WannaCry Holdout: When evaluated on 157 test binaries of ransomware_wannacry held out from training, the model achieved 100.0% recall with a mean classification confidence of 0.9297 (Fig. fig:wannacry_holdout).</w:t>
-        <w:br/>
-        <w:t xml:space="preserve">    • Temporal Drift Evaluation: When partitioned across four chronological windows of 375 samples each, test accuracies were 99.47%, 100.0%, 99.73%, and 99.73%, exhibiting a negligible F1 drift drop of \Delta\text{F1} = -0.0028. To maintain scientific transparency, we disclose that the chronological timestamps originate from catalog simulation parameters; true longitudinal temporal drift on prospective zero-day samples remains an operational threat to validity.</w:t>
+        <w:t>To evaluate sensitivity to malware variants whose specific strain was completely withheld from training, all 157 binaries belonging to the ransomware_wannacry family were excluded from the training and validation cohorts and evaluated strictly at test inference. The tri-modal model achieved 100.00% recall (157 of 157 detected) with a mean classification confidence score of 0.9297 (Fig. fig:wannacry_holdout). While this demonstrates robust variant detection within a held-out ransomware strain, we explicitly note that shared inductive priors (e.g., cryptographic API calls and packer runtime routines shared across other ransomware strains in the training set) facilitate classification. Therefore, this result reflects a single-family sample holdout rather than universal zero-day generalization.</w:t>
+      </w:r>
+    </w:p>
+    <w:p>
+      <w:pPr>
+        <w:spacing w:before="200" w:after="80"/>
+      </w:pPr>
+      <w:r>
+        <w:rPr>
+          <w:rFonts w:ascii="Times New Roman" w:hAnsi="Times New Roman"/>
+          <w:b/>
+          <w:color w:val="1E293B"/>
+          <w:sz w:val="24"/>
+        </w:rPr>
+        <w:t>12.2 Simulated Chronological Partition Evaluation</w:t>
+      </w:r>
+    </w:p>
+    <w:p>
+      <w:r>
+        <w:t>To assess stability across simulated longitudinal acquisition periods, the test cohort was partitioned into four chronological windows of 375 samples each. Empirical test accuracies remained stable across partitions: 99.47% (Window 1), 100.00% (Window 2), 99.73% (Window 3), and 99.73% (Window 4), yielding a minimal observed F1 shift of \Delta\text{F1} = -0.0028. Crucially, as disclosed in Section sec:validity, these chronological timestamps were assigned based on catalog simulation metadata rather than longitudinal real-world deployment telemetry. Consequently, these results must be interpreted as a simulated chronological partition evaluation rather than genuine multi-year prospective temporal drift validation.</w:t>
       </w:r>
     </w:p>
     <w:p>
@@ -853,11 +886,11 @@
     </w:p>
     <w:p>
       <w:r>
-        <w:t>• UPX Packing (Failure Case Disclosed): Accuracy drops to 88.0% with a 24.0% false positive rate on packed benign executables (120/500), caused by compression entropy elevation (&gt;7.2 bits/byte). Attention reweights from opcode (0.389) to syscalls (0.343).</w:t>
+        <w:t>• UPX Packing (Failure Case Disclosed): Accuracy drops to 88.00% with a 24.00% false positive rate on packed benign executables (120/500), caused by compression entropy elevation (&gt;7.2 bits/byte). Attention reweights from opcode (0.389) to syscalls (0.343).</w:t>
         <w:br/>
-        <w:t xml:space="preserve">    • Dead-Code Insertion (Failure Case Disclosed): Accuracy drops to 80.0% with a 40.0% false negative rate (200/500 missed) due to token sequence flooding displacing informative prologue opcodes.</w:t>
+        <w:t xml:space="preserve">    • Dead-Code Insertion (Failure Case Disclosed): Accuracy drops to 80.00% with a 40.00% false negative rate (200/500 missed) due to token sequence flooding displacing informative prologue opcodes.</w:t>
         <w:br/>
-        <w:t xml:space="preserve">    • CFG Flattening &amp; Stalling: Model retains 96.0% accuracy under CFF and 98.0% under sandbox stalling by reallocating attention to uncorrupted channels.</w:t>
+        <w:t xml:space="preserve">    • CFG Flattening &amp; Stalling: Model retains 96.00% accuracy under CFF and 98.00% under sandbox stalling by reallocating attention to uncorrupted channels.</w:t>
       </w:r>
     </w:p>
     <w:p>
@@ -881,17 +914,22 @@
           <w:color w:val="1E3A8A"/>
           <w:sz w:val="28"/>
         </w:rPr>
-        <w:t>14 Computational Efficiency</w:t>
+        <w:t>14 Computational Efficiency and End-to-End Latency</w:t>
       </w:r>
     </w:p>
     <w:p>
       <w:r>
-        <w:t>Module-level profiling confirms that the full tri-modal forward pass requires 28.87 ms on CPU (throughput: 34.6 samples/sec), whereas fast static triage requires only 17.53 ms (throughput: 57.0 samples/sec) (Table tab:latency_breakdown and Fig. fig:latency_triage). Static triage resolves 86.2% of binaries in Stage 1 with 99.23% accuracy, cutting dynamic sandbox load by 86.2%. Crucially, the 28.87 ms neural inference latency is strictly decoupled from dynamic guest-VM sandbox execution, which requires 30\text{--}120 seconds per sample in automated detonation environments.</w:t>
+        <w:t>A crucial methodological requirement in operational cybersecurity is rigorously delineating neural inference latency from end-to-end binary analysis latency. Table tab:end_to_end_latency provides a complete stage-by-stage latency profile decomposing static ingestion, neural forward passes, and dynamic execution paths.</w:t>
       </w:r>
     </w:p>
     <w:p>
       <w:r>
         <w:t>[TABLE INSERTED HERE]</w:t>
+      </w:r>
+    </w:p>
+    <w:p>
+      <w:r>
+        <w:t>As demonstrated in Table tab:end_to_end_latency, isolated neural forward execution requires 28.87 ms for the tri-modal architecture (34.6 samples/sec) and 17.53 ms for Stage 1 fast static triage (57.0 samples/sec) (Fig. fig:latency_triage). However, complete binary ingestion requires PE parsing (1.20 ms), disassembly (12.40 ms), and CFG generation (45.60 ms), yielding an end-to-end static path latency of 76.90 ms. In stark contrast, full dynamic behavioral analysis requires guest-VM provisioning and execution timeouts ranging from 30 to 120 seconds (30,000\text{--}120,000 ms) per binary. The proposed operational triage mechanism bridges this gap: by resolving 86.2% of binaries exclusively through the 76.90 ms static path with 99.23% accuracy, it prevents dynamic sandbox queue exhaustion, routing only the 13.8% ambiguous samples to VM detonation.</w:t>
       </w:r>
     </w:p>
     <w:p>
@@ -952,9 +990,9 @@
         <w:br/>
         <w:t xml:space="preserve">    • CFG Construction Overhead: angr CFG generation on massive binaries was bounded by a 30s timeout.</w:t>
         <w:br/>
-        <w:t xml:space="preserve">    • UPX Benign False Positives: Packed benign executables exhibit a 24.0% FPR.</w:t>
+        <w:t xml:space="preserve">    • UPX Benign False Positives: Packed benign executables exhibit a 24.00% FPR.</w:t>
         <w:br/>
-        <w:t xml:space="preserve">    • Dead-Code Truncation: Sequence flooding pushes API calls beyond the 2048 token budget.</w:t>
+        <w:t xml:space="preserve">    • Dead-Code Truncation: Sequence flooding pushes API calls beyond the 2048 token budget (40.00% FNR).</w:t>
         <w:br/>
         <w:t xml:space="preserve">    • Lack of Theoretical Guarantee: GRAM regularizes parallelotope volume empirically without formal collapse proofs.</w:t>
         <w:br/>
@@ -964,11 +1002,11 @@
         <w:br/>
         <w:t xml:space="preserve">    • Operand Normalization Loss: Abstraction of MEM and REG masks heap layout geometry.</w:t>
         <w:br/>
-        <w:t xml:space="preserve">    • Hardware Dependence: Neural latency benchmarks are CPU-specific (28.87 ms on Apple Silicon).</w:t>
+        <w:t xml:space="preserve">    • Hardware Dependence: Neural latency benchmarks are CPU-specific (28.87 ms on Apple Silicon). Static preprocessing (59.35 ms) and dynamic guest-VM detonation (30\text{--}120 s) vary across host virtualization environments.</w:t>
         <w:br/>
-        <w:t xml:space="preserve">    • Simulated Temporal Partitions: Temporal timestamps were recorded from catalog simulations.</w:t>
+        <w:t xml:space="preserve">    • Simulated Chronological Partitions: Chronological timestamps were assigned based on catalog simulation metadata rather than longitudinal real-world telemetry; prospective temporal drift under evolving malware ecologies remains unmeasured.</w:t>
         <w:br/>
-        <w:t xml:space="preserve">    • Single-Family Holdout Constraint: True zero-day claims are limited by shared training lineages.</w:t>
+        <w:t xml:space="preserve">    • Single-Family Holdout Constraint: The 157-sample WannaCry evaluation tests variant detection when a specific strain is withheld from training. However, shared cryptographic routines and compiler runtimes across other training families provide inductive priors; it does not establish universal zero-day immunity.</w:t>
         <w:br/>
         <w:t xml:space="preserve">    • External Validity: Generalization to non-PE formats (ELF, Mach-O) requires intermediate IR compilation.</w:t>
       </w:r>
@@ -989,7 +1027,7 @@
     </w:p>
     <w:p>
       <w:r>
-        <w:t>The empirical results demonstrate that cross-modal representation alignment fundamentally outperforms unimodal detection. While unimodal branches achieve accuracies between 80.07% and 86.47%, the joint tri-modal framework reaches 99.73%. The operational triage filter bridges the practical gap between high accuracy and dynamic execution cost, resolving over 86% of binaries in static mode.</w:t>
+        <w:t>The empirical results demonstrate that cross-modal representation alignment achieves substantially higher observed detection performance than unimodal detection. While individual unimodal branches achieve accuracies between 80.07% and 86.47%, the joint tri-modal framework reaches 99.73%. This performance gain stems from the geometric synergy enforced by pairwise InfoNCE alignment and Volumetric Gramian regularization, which prevents modality collapse and preserves orthogonal semantic capacity. Furthermore, dynamic attention weights serve as an adaptive defense: when static token sequences are distorted by packing or instruction padding, the architecture dynamically upweights dynamic behavioral traces. Crucially, the two-stage operational triage filter resolves 86.2% of samples within the 76.90 ms static ingestion path, successfully insulating high-cost dynamic sandbox queues from throughput collapse.</w:t>
       </w:r>
     </w:p>
     <w:p>
@@ -1008,7 +1046,7 @@
     </w:p>
     <w:p>
       <w:r>
-        <w:t>Primary limitations include the single-architecture PE focus, sandbox queue dependencies for ambiguous samples, vulnerability of static opcodes to compression entropy (UPX), and token budget constraints under dead-code insertion. Future work will investigate intermediate compiler IR representations (e.g., LLVM IR) to enable cross-ISA portability.</w:t>
+        <w:t>Primary limitations include: (1) single-ISA Windows PE focus, which restricts direct application to ELF or Mach-O binaries; (2) sandbox queue dependence for the 13.8% deferred ambiguous cohort; (3) vulnerability of static opcodes to compression entropy under UPX packing (24.00% FPR on benign packed binaries); (4) sequence truncation under dead-code insertion (40.00% FNR); and (5) reliance on catalog simulation metadata for chronological partitioning rather than longitudinal prospective field data. Future research will explore intermediate compiler representations (e.g., LLVM IR) to achieve cross-ISA portability and evaluate longitudinal telemetry across multi-year enterprise deployments.</w:t>
       </w:r>
     </w:p>
     <w:p>
@@ -1027,7 +1065,7 @@
     </w:p>
     <w:p>
       <w:r>
-        <w:t>This study presented a reproducible, evidence-driven tri-modal deep learning framework for malware detection, accompanied by a PRISMA 2020 systematic review of 15 primary peer-reviewed journal benchmark studies. By regularizing Opcode Transformers, CFG-GINs, and Syscall Bi-LSTMs via pairwise InfoNCE alignment and Volumetric Gramian loss, the architecture achieved 99.73% accuracy and 100.0% precision on 1,500 held-out test binaries, with 100.0% recall on a single-family WannaCry holdout. Honest disclosure of failure modes under UPX packing and dead-code insertion establishes defensible operational boundaries for production deployment.</w:t>
+        <w:t>This study presented a reproducible, evidence-driven tri-modal deep learning framework for malware detection, accompanied by a PRISMA 2020 systematic review of 15 primary peer-reviewed journal benchmark studies. By regularizing Opcode Transformers, CFG-GINs, and Syscall Bi-LSTMs via pairwise InfoNCE alignment and Volumetric Gramian loss, the architecture achieved 99.73% accuracy and 100.00% precision on 1,500 held-out test binaries, with 100.00% recall on a single-family WannaCry sample holdout. Transparent disclosure of failure modes under UPX packing (24.00% benign FPR) and dead-code insertion (40.00% FNR) establishes defensible operational boundaries for the evaluated enterprise deployment scenario.</w:t>
       </w:r>
     </w:p>
     <w:p>
@@ -1046,7 +1084,7 @@
     </w:p>
     <w:p>
       <w:r>
-        <w:t>The complete code repository, model checkpoints, tensor shards, and automated test suite are openly available at \url{https://github.com/kohlirupesh19/Multi-Model.git} on the dedicated publication-validation branch. All experimental results, baseline comparisons, ablations, and figures can be reproduced in a single command by executing bash reproduce_all.sh or python3 reproduce_all.py. Dedicated verification audit ledgers and raw evaluation artifacts are provided in the repository's reports/ and results/verified/ directories.</w:t>
+        <w:t>The complete code repository, model checkpoints, tensor shards, and automated test suite are openly available at \url{https://github.com/kohlirupesh19/Multi-Model.git} on the dedicated publication-validation branch. The repository provides scripts and artifacts for reproducing the reported experiments (bash reproduce_all.sh or python3 reproduce_all.py). Dedicated verification audit ledgers and raw evaluation artifacts are provided in the repository's reports/ and results/verified/ directories.</w:t>
       </w:r>
     </w:p>
     <w:p>
@@ -1069,7 +1107,7 @@
         <w:br/>
         <w:t xml:space="preserve">Conflict of Interest: The authors declare that they have no conflict of interest.  </w:t>
         <w:br/>
-        <w:t xml:space="preserve">Data Availability Statement: All benchmark manifests, pre-computed feature shards, checkpoints, and evaluation scripts are available in the public repository. Raw executable binaries are governed by their original distribution repositories (VirusShare, VX-Underground).  </w:t>
+        <w:t xml:space="preserve">Data Availability Statement: All derived benchmark manifests, pre-computed feature shards, checkpoints, and evaluation scripts are available in the public repository. Due to security containment policies and third-party licensing constraints, raw executable binaries cannot be redistributed directly; they must be acquired from their primary archival repositories (VirusShare, VX-Underground) using the provided SHA-256 catalog manifests.  </w:t>
         <w:br/>
         <w:t xml:space="preserve">Authors' Contributions: All authors contributed to study conceptualization, architecture design, formal PRISMA review, software implementation, benchmarking, and manuscript preparation.  </w:t>
         <w:br/>
@@ -1130,7 +1168,7 @@
         <w:t xml:space="preserve">• Availability of Data and Code: </w:t>
       </w:r>
       <w:r>
-        <w:t>All benchmark manifests, model checkpoints, feature processing pipelines, evaluation scripts, and structured verification spreadsheets are openly accessible for peer-reviewer verification at GitHub: https://github.com/kohlirupesh19/Multi-Model. Benchmark datasets, manifests, and frozen evaluation splits are directly accessible at https://github.com/kohlirupesh19/Multi-Model/tree/main/datasets. The dedicated directory Research Paper/verification_excel/ contains master and modular Excel workbooks documenting reviewer compliance, claim provenance, test-split disjointness, and raw metric calculations.</w:t>
+        <w:t>The derived experimental artifacts, benchmark manifests, pre-computed multimodal feature shards, model checkpoints, preprocessing code, and reproduction test suites are openly available at https://github.com/kohlirupesh19/Multi-Model.git on the dedicated publication-validation branch. The repository provides scripts and artifacts for reproducing the reported experiments (bash reproduce_all.sh or python3 reproduce_all.py). Due to security containment policies and third-party licensing constraints, raw executable binaries cannot be redistributed directly; they must be acquired from their primary archival repositories (VirusShare, VX-Underground) using the provided SHA-256 catalog manifests.</w:t>
       </w:r>
     </w:p>
     <w:p>

</xml_diff>

<commit_message>
fix(ISSUE-04): differentiate primary empirical research from benchmark reviews in PRISMA synthesis and Table 1
</commit_message>
<xml_diff>
--- a/manuscript/revised/FINAL_REVISED_MANUSCRIPT.docx
+++ b/manuscript/revised/FINAL_REVISED_MANUSCRIPT.docx
@@ -81,7 +81,7 @@
               <w:rPr>
                 <w:sz w:val="20"/>
               </w:rPr>
-              <w:t>Single-modality binary analysis remains acutely vulnerable to adversarial evasion, including instruction substitution, control-flow flattening, and sandbox stalling. Multimodal deep learning offers cross-channel resilience, but existing literature suffers from unharmonized evaluation splits and irreproducible benchmarks. This study establishes a dual-contribution framework. First, following PRISMA 2020, we systematically review multimodal binary similarity analysis, auditing 15 primary peer-reviewed journal benchmark studies across five bibliographic and publisher search platforms (IEEE Xplore, ACM Digital Library, ScienceDirect, SpringerLink, Wiley Online Library, with Scopus indexing verification). Second, we present a reproducible tri-modal architecture combining an Opcode Transformer, a Graph Isomorphism Network (GIN), and a dynamic Syscall Bi-LSTM aligned on the unit hypersphere via pairwise InfoNCE and Volumetric Gramian (GRAM) regularizers with attention late fusion. On an author-constructed 100,000-binary catalog manifest with 10,000 materialized multimodal instances (7,000 train, 1,500 validation, 1,500 held-out test), the framework achieves 99.73% test accuracy (Wilson 95% CI: [99.32%, 99.90%]; Bootstrap 95% CI: [99.47%, 99.93%]), 100.00% precision, and 99.46% recall on the 1,500 held-out test binaries (740 TP, 756 TN, 4 FN, 0 FP). Under a single-family sample holdout protocol on 157 WannaCry test binaries, it attains 100.00% recall with 0.9297 mean confidence. Under UPX packing, accuracy drops to 88.00% with a 24.00% false positive rate on packed benign binaries, while dead-code insertion causes a 40.00% false negative rate, establishing explicit operational boundaries. Neural forward latency is 28.87 ms on CPU (total static ingestion and triage latency: 76.90 ms); a two-stage triage filter resolves 86.2% of binaries in Stage 1 (17.53 ms neural inference), bypassing costly dynamic sandbox detonation for 86.2% of samples.</w:t>
+              <w:t>Single-modality binary analysis remains acutely vulnerable to adversarial evasion, including instruction substitution, control-flow flattening, and sandbox stalling. Multimodal deep learning offers cross-channel resilience, but existing literature suffers from unharmonized evaluation splits and irreproducible benchmarks. This study establishes a dual-contribution framework. First, following PRISMA 2020, we systematically review multimodal binary similarity analysis, auditing 15 peer-reviewed journal benchmark studies (13 primary empirical investigations and 2 benchmark synthesis reviews) across five bibliographic and publisher search platforms (IEEE Xplore, ACM Digital Library, ScienceDirect, SpringerLink, Wiley Online Library, with Scopus indexing verification). Second, we present a reproducible tri-modal architecture combining an Opcode Transformer, a Graph Isomorphism Network (GIN), and a dynamic Syscall Bi-LSTM aligned on the unit hypersphere via pairwise InfoNCE and Volumetric Gramian (GRAM) regularizers with attention late fusion. On an author-constructed 100,000-binary catalog manifest with 10,000 materialized multimodal instances (7,000 train, 1,500 validation, 1,500 held-out test), the framework achieves 99.73% test accuracy (Wilson 95% CI: [99.32%, 99.90%]; Bootstrap 95% CI: [99.47%, 99.93%]), 100.00% precision, and 99.46% recall on the 1,500 held-out test binaries (740 TP, 756 TN, 4 FN, 0 FP). Under a single-family sample holdout protocol on 157 WannaCry test binaries, it attains 100.00% recall with 0.9297 mean confidence. Under UPX packing, accuracy drops to 88.00% with a 24.00% false positive rate on packed benign binaries, while dead-code insertion causes a 40.00% false negative rate, establishing explicit operational boundaries. Neural forward latency is 28.87 ms on CPU (total static ingestion and triage latency: 76.90 ms); a two-stage triage filter resolves 86.2% of binaries in Stage 1 (17.53 ms neural inference), bypassing costly dynamic sandbox detonation for 86.2% of samples.</w:t>
             </w:r>
           </w:p>
         </w:tc>
@@ -195,7 +195,7 @@
     </w:p>
     <w:p>
       <w:r>
-        <w:t>• Systematic Evidence Synthesis: A PRISMA 2020 systematic review synthesizing multimodal binary similarity analysis literature across five bibliographic/publisher databases and indexing platforms (n = 842 initial records, 15 included primary peer-reviewed journal benchmark studies, inter-rater reliability \kappa = 0.88), categorizing methodological strengths, risk of bias, and reporting gaps.</w:t>
+        <w:t>• Systematic Evidence Synthesis: A PRISMA 2020 systematic review synthesizing multimodal binary similarity analysis literature across five bibliographic/publisher databases and indexing platforms (n = 842 initial records, 15 included peer-reviewed journal benchmark studies comprising 13 primary empirical investigations and 2 benchmark synthesis reviews, inter-rater reliability \kappa = 0.88), categorizing methodological strengths, risk of bias, and reporting gaps.</w:t>
         <w:br/>
         <w:t xml:space="preserve">    • Reproducible Tri-Modal Architecture: A unified deep learning architecture integrating Opcode Transformers, Control Flow Graph GIN encoders, and dynamic Syscall Bi-LSTMs, regularized through pairwise InfoNCE contrastive alignment and Volumetric Gramian (GRAM) non-orthogonality loss to mitigate asynchronous channel collapse.</w:t>
         <w:br/>
@@ -308,7 +308,7 @@
     </w:p>
     <w:p>
       <w:r>
-        <w:t>Initial title and abstract screening was conducted independently by two reviewers, eliminating 568 studies. Full texts of the remaining 58 candidate studies were inspected in detail. Disagreements were adjudicated by a senior third reviewer, achieving an inter-rater Cohen's kappa coefficient of \kappa = 0.84, indicating strong reliability. A total of 43 full texts were excluded with documented rationales: 16 non-refereed preprints or non-journal reports, 14 lacking reproducible evaluation protocols or accessible artifacts, 8 addressing non-PE architectures outside the target scope, and 5 lacking standardized classification metric definitions. Exactly 15 primary peer-reviewed journal benchmark studies were retained (Fig. fig:prisma_flow and Table tab:primary_studies).</w:t>
+        <w:t>Initial title and abstract screening was conducted independently by two reviewers, eliminating 568 studies. Full texts of the remaining 58 candidate studies were inspected in detail. Disagreements were adjudicated by a senior third reviewer, achieving an inter-rater Cohen's kappa coefficient of \kappa = 0.84, indicating strong reliability. A total of 43 full texts were excluded with documented rationales: 16 non-refereed preprints or non-journal reports, 14 lacking reproducible evaluation protocols or accessible artifacts, 8 addressing non-PE architectures outside the target scope, and 5 lacking standardized classification metric definitions. Exactly 15 peer-reviewed journal benchmark studies were retained: 13 primary empirical investigations and 2 benchmark synthesis reviews (Fig. fig:prisma_flow and Table tab:primary_studies).</w:t>
       </w:r>
     </w:p>
     <w:p>
@@ -332,7 +332,7 @@
     </w:p>
     <w:p>
       <w:r>
-        <w:t>Each included primary study was assessed across six Domain Quality Criteria (DQA): DQA1 (Dataset provenance clarity), DQA2 (Train/test leakage prevention), DQA3 (Zero-day evaluation design), DQA4 (Baseline comparability), DQA5 (Hyperparameter transparency), and DQA6 (Statistical significance and confidence reporting). Each criterion was graded as High Quality (2), Moderate Quality (1), or Low Quality / High Risk of Bias (0) (Table tab:risk_of_bias).</w:t>
+        <w:t>Each included study was assessed across six Domain Quality Criteria (DQA): DQA1 (Dataset provenance clarity), DQA2 (Train/test leakage prevention), DQA3 (Zero-day evaluation design), DQA4 (Baseline comparability), DQA5 (Hyperparameter transparency), and DQA6 (Statistical significance and confidence reporting). Each criterion was graded as High Quality (2), Moderate Quality (1), or Low Quality / High Risk of Bias (0) (Table tab:risk_of_bias).</w:t>
       </w:r>
     </w:p>
     <w:p>
@@ -1065,7 +1065,7 @@
     </w:p>
     <w:p>
       <w:r>
-        <w:t>This study presented a reproducible, evidence-driven tri-modal deep learning framework for malware detection, accompanied by a PRISMA 2020 systematic review of 15 primary peer-reviewed journal benchmark studies. By regularizing Opcode Transformers, CFG-GINs, and Syscall Bi-LSTMs via pairwise InfoNCE alignment and Volumetric Gramian loss, the architecture achieved 99.73% accuracy and 100.00% precision on 1,500 held-out test binaries, with 100.00% recall on a single-family WannaCry sample holdout. Transparent disclosure of failure modes under UPX packing (24.00% benign FPR) and dead-code insertion (40.00% FNR) establishes defensible operational boundaries for the evaluated enterprise deployment scenario.</w:t>
+        <w:t>This study presented a reproducible, evidence-driven tri-modal deep learning framework for malware detection, accompanied by a PRISMA 2020 systematic review of 15 peer-reviewed journal benchmark studies (13 primary empirical investigations and 2 benchmark synthesis reviews). By regularizing Opcode Transformers, CFG-GINs, and Syscall Bi-LSTMs via pairwise InfoNCE alignment and Volumetric Gramian loss, the architecture achieved 99.73% accuracy and 100.00% precision on 1,500 held-out test binaries, with 100.00% recall on a single-family WannaCry sample holdout. Transparent disclosure of failure modes under UPX packing (24.00% benign FPR) and dead-code insertion (40.00% FNR) establishes defensible operational boundaries for the evaluated enterprise deployment scenario.</w:t>
       </w:r>
     </w:p>
     <w:p>

</xml_diff>

<commit_message>
fix(ISSUE-05): define orthogonal representation spaces for IC2/EC3 and resolve MalInsight multimodal modalities in Table 1
</commit_message>
<xml_diff>
--- a/manuscript/revised/FINAL_REVISED_MANUSCRIPT.docx
+++ b/manuscript/revised/FINAL_REVISED_MANUSCRIPT.docx
@@ -287,9 +287,9 @@
     </w:p>
     <w:p>
       <w:r>
-        <w:t>• Inclusion Criteria (IC): (IC1) Peer-reviewed journal articles published in indexed venues; (IC2) Multimodal analysis combining at least two distinct feature modalities; (IC3) Target domain focused on compiled software binaries (x86, x64, ARM, MIPS); (IC4) Quantitative reporting of detection or retrieval metrics (Accuracy, F1, AUC, Recall).</w:t>
+        <w:t>• Inclusion Criteria (IC): (IC1) Peer-reviewed journal articles published in indexed venues; (IC2) Multimodal analysis combining at least two distinct feature modalities across orthogonal representation spaces (static lexical/token sequences, static/dynamic topological graphs, dynamic behavioral traces, and structural/declarative metadata); (IC3) Target domain focused on compiled software binaries (x86, x64, ARM, MIPS); (IC4) Quantitative reporting of detection or retrieval metrics (Accuracy, F1, AUC, Recall).</w:t>
         <w:br/>
-        <w:t xml:space="preserve">    • Exclusion Criteria (EC): (EC1) Non-peer-reviewed preprints (e.g., TechRxiv, SSRN, Research Square); (EC2) Non-English publications; (EC3) Work limited strictly to unimodal analysis; (EC4) Irrelevant domains (e.g., payment fraud, network traffic, clinical image classification).</w:t>
+        <w:t xml:space="preserve">    • Exclusion Criteria (EC): (EC1) Non-peer-reviewed preprints (e.g., TechRxiv, SSRN, Research Square); (EC2) Non-English publications; (EC3) Work limited strictly to unimodal analysis or single-space feature variations (e.g., combining multiple static n-gram lengths without cross-space multimodal fusion); (EC4) Irrelevant domains (e.g., payment fraud, network traffic, clinical image classification).</w:t>
       </w:r>
     </w:p>
     <w:p>

</xml_diff>

<commit_message>
fix(ISSUE-07): resolve reference 16 bibliographic audit and correct ACM page range formatting in bibtex
</commit_message>
<xml_diff>
--- a/manuscript/revised/FINAL_REVISED_MANUSCRIPT.docx
+++ b/manuscript/revised/FINAL_REVISED_MANUSCRIPT.docx
@@ -1667,7 +1667,7 @@
         <w:t xml:space="preserve">[18] </w:t>
       </w:r>
       <w:r>
-        <w:t xml:space="preserve">Yi Tay and Mostafa Dehghani and Dara Bahri and Donald Metzler (2022). Efficient Transformers: A Survey. </w:t>
+        <w:t xml:space="preserve">Yi Tay and Mostafa Dehghani and Dara Bahri and Donald Metzler (2023). Efficient Transformers: A Survey. </w:t>
       </w:r>
       <w:r>
         <w:rPr>
@@ -1721,7 +1721,7 @@
         <w:t xml:space="preserve">[20] </w:t>
       </w:r>
       <w:r>
-        <w:t xml:space="preserve">Pei Liu and Xiangyu Zhang and Marco Pistoia and Yun Shen and Guofei Gu (2022). Deep Learning for Android Malware Defenses: A Systematic Literature Review. </w:t>
+        <w:t xml:space="preserve">Pei Liu and Xiangyu Zhang and Marco Pistoia and Yun Shen and Guofei Gu (2023). Deep Learning for Android Malware Defenses: A Systematic Literature Review. </w:t>
       </w:r>
       <w:r>
         <w:rPr>

</xml_diff>

<commit_message>
fix(ISSUE-08): purge irrelevant cyber-physical power grid citations and streamline Related Work to 26 core references
</commit_message>
<xml_diff>
--- a/manuscript/revised/FINAL_REVISED_MANUSCRIPT.docx
+++ b/manuscript/revised/FINAL_REVISED_MANUSCRIPT.docx
@@ -230,7 +230,7 @@
     </w:p>
     <w:p>
       <w:r>
-        <w:t>Multimodal learning seeks to unify these orthogonal perspectives [Baltrusaitis2019]. Recent contrastive frameworks leverage InfoNCE and multi-view objectives to align cross-modal embeddings [LeKhac2020,FewMHGCL2023,BinCola2024]. Concurrently, longitudinal evaluation protocols have underscored the impact of concept drift and dataset shift over time [Joyce2023MOTIF,Jiang2024BenchMFC,Guerra2022]. In cyber-physical and power grid infrastructures, machine learning-driven anomaly detection has demonstrated critical defensive utility against false-data injection and network-level intrusion [Almalaq2023Power,Almalaq2022Deep,Alnowibet2021Energy]. Nevertheless, prior multimodal works frequently lack open evaluation tensors and fail to delineate operational triage boundaries.</w:t>
+        <w:t>Multimodal learning seeks to unify these orthogonal perspectives [Baltrusaitis2019]. Recent contrastive frameworks leverage InfoNCE and multi-view objectives to align cross-modal embeddings [LeKhac2020,FewMHGCL2023,BinCola2024]. Concurrently, longitudinal evaluation protocols have underscored the impact of concept drift and dataset shift over time [Joyce2023MOTIF,Jiang2024BenchMFC,Guerra2022]. Nevertheless, prior multimodal works frequently lack open evaluation tensors and fail to delineate operational triage boundaries.</w:t>
       </w:r>
     </w:p>
     <w:p>
@@ -1896,87 +1896,6 @@
           <w:color w:val="2563EB"/>
         </w:rPr>
         <w:t>https://doi.org/10.1016/j.jnca.2018.10.022</w:t>
-      </w:r>
-    </w:p>
-    <w:p>
-      <w:pPr>
-        <w:spacing w:after="80"/>
-        <w:ind w:left="360" w:hanging="360"/>
-      </w:pPr>
-      <w:r>
-        <w:rPr>
-          <w:b/>
-        </w:rPr>
-        <w:t xml:space="preserve">[27] </w:t>
-      </w:r>
-      <w:r>
-        <w:t xml:space="preserve">Abdulaziz Almalaq and Saleh Albadran and Mohamed A. Mohamed (2023). An Adoptive Miner-Misuse Based Online Anomaly Detection Approach in the Power System: An Optimum Reinforcement Learning Method. </w:t>
-      </w:r>
-      <w:r>
-        <w:rPr>
-          <w:i/>
-        </w:rPr>
-        <w:t xml:space="preserve">Mathematics. </w:t>
-      </w:r>
-      <w:r>
-        <w:rPr>
-          <w:color w:val="2563EB"/>
-        </w:rPr>
-        <w:t>https://doi.org/10.3390/math11040884</w:t>
-      </w:r>
-    </w:p>
-    <w:p>
-      <w:pPr>
-        <w:spacing w:after="80"/>
-        <w:ind w:left="360" w:hanging="360"/>
-      </w:pPr>
-      <w:r>
-        <w:rPr>
-          <w:b/>
-        </w:rPr>
-        <w:t xml:space="preserve">[28] </w:t>
-      </w:r>
-      <w:r>
-        <w:t xml:space="preserve">Abdulaziz Almalaq and Saleh Albadran and Mohamed Mohamed (2022). Deep Machine Learning Model-Based Cyber-Attacks Detection in Smart Power Systems. </w:t>
-      </w:r>
-      <w:r>
-        <w:rPr>
-          <w:i/>
-        </w:rPr>
-        <w:t xml:space="preserve">Mathematics. </w:t>
-      </w:r>
-      <w:r>
-        <w:rPr>
-          <w:color w:val="2563EB"/>
-        </w:rPr>
-        <w:t>https://doi.org/10.3390/math10152574</w:t>
-      </w:r>
-    </w:p>
-    <w:p>
-      <w:pPr>
-        <w:spacing w:after="80"/>
-        <w:ind w:left="360" w:hanging="360"/>
-      </w:pPr>
-      <w:r>
-        <w:rPr>
-          <w:b/>
-        </w:rPr>
-        <w:t xml:space="preserve">[29] </w:t>
-      </w:r>
-      <w:r>
-        <w:t xml:space="preserve">Khalid Alnowibet and Andres Annuk and Anura Dampage and Mohamed A. Mohamed (2021). Effective Energy Management via False Data Detection Scheme for the Interconnected Smart Energy Hub--Microgrid System under Stochastic Framework. </w:t>
-      </w:r>
-      <w:r>
-        <w:rPr>
-          <w:i/>
-        </w:rPr>
-        <w:t xml:space="preserve">Sustainability. </w:t>
-      </w:r>
-      <w:r>
-        <w:rPr>
-          <w:color w:val="2563EB"/>
-        </w:rPr>
-        <w:t>https://doi.org/10.3390/su132111836</w:t>
       </w:r>
     </w:p>
     <w:p>

</xml_diff>

<commit_message>
fix(ISSUE-11): formalize simulated chronological partition evaluation protocol and qualify temporal stability claims
</commit_message>
<xml_diff>
--- a/manuscript/revised/FINAL_REVISED_MANUSCRIPT.docx
+++ b/manuscript/revised/FINAL_REVISED_MANUSCRIPT.docx
@@ -720,24 +720,29 @@
     </w:p>
     <w:p>
       <w:r>
-        <w:t>Seven baseline architectures were evaluated on the exact same 1,500 held-out test binaries: four were reproduced internally from native repository components (Opcode Transformer, CFG-GIN, Syscall Bi-LSTM, and Concat MLP), while three were independently reimplemented based on their published architectural specifications (MalConv, Gemini, and Asm2Vec) and executed on the identical evaluation tensors:</w:t>
+        <w:t>Seven baseline architectures were evaluated on the exact same 1,500 held-out test binaries: four were reproduced internally from native repository components (Opcode Transformer, CFG-GIN, Syscall Bi-LSTM, and Concat MLP), one was independently reimplemented based on published malware detection specifications (MalConv), and two representation/similarity models (Asm2Vec and Gemini) were reimplemented and adapted for supervised binary classification:</w:t>
       </w:r>
     </w:p>
     <w:p>
       <w:r>
-        <w:t>• Opcode Transformer Only (Internally Reproduced): Unimodal static token baseline (d_{\text{model}} = 128, 4 layers) with masked mean pooling.</w:t>
+        <w:t>• Opcode Transformer Only (Internally Reproduced): Unimodal static token baseline (d_{\text{model}} = 128, 4 layers) with masked mean pooling and linear classification head.</w:t>
         <w:br/>
-        <w:t xml:space="preserve">    • CFG-GIN Only (Internally Reproduced): Unimodal graph neural network baseline (K = 3 layers) over inter-procedural CFGs.</w:t>
+        <w:t xml:space="preserve">    • CFG-GIN Only (Internally Reproduced): Unimodal graph neural network baseline (K = 3 layers) over inter-procedural CFGs with sum pooling.</w:t>
         <w:br/>
         <w:t xml:space="preserve">    • Syscall Bi-LSTM Only (Internally Reproduced): Unimodal dynamic behavioral trace baseline (2 layers) over logged API call sequences.</w:t>
         <w:br/>
-        <w:t xml:space="preserve">    • Concat MLP / Early Fusion (Internally Reproduced): Direct feature vector concatenation without InfoNCE alignment or Volumetric GRAM regularization.</w:t>
+        <w:t xml:space="preserve">    • Concat MLP / Early Fusion (Internally Reproduced): Direct feature vector concatenation (3 \times 128 = 384 dim) without InfoNCE alignment or Volumetric GRAM regularization.</w:t>
         <w:br/>
-        <w:t xml:space="preserve">    • MalConv Gated CNN (Reimplemented Benchmark): Byte-level convolutional network with temporal max-pooling reimplemented based on Gibert et al. [Gibert2020].</w:t>
+        <w:t xml:space="preserve">    • MalConv Gated CNN (Reimplemented Benchmark): Byte-level convolutional network (filter size 500, kernel size 8) with temporal global max-pooling and a 128-dimensional dense classifier, reimplemented based on Gibert et al. [Gibert2020].</w:t>
         <w:br/>
-        <w:t xml:space="preserve">    • Gemini Structure2Vec (Reimplemented Benchmark): Graph embedding baseline for binary similarity reimplemented from published specifications [Kim2023Revisiting].</w:t>
+        <w:t xml:space="preserve">    • Gemini Structure2Vec (Adapted &amp; Reimplemented): Originally designed for binary code similarity search [Kim2023Revisiting], adapted for malware detection by extracting Attributed Control Flow Graphs (ACFGs), computing Structure2Vec message-passing embeddings (d = 128), and appending a 2-layer MLP classification head trained via cross-entropy.</w:t>
         <w:br/>
-        <w:t xml:space="preserve">    • Asm2Vec Word2Vec (Reimplemented Benchmark): Assembly instruction co-occurrence representation baseline reimplemented based on Zhao et al. [BinCola2024].</w:t>
+        <w:t xml:space="preserve">    • Asm2Vec Word2Vec (Adapted &amp; Reimplemented): Originally proposed for assembly function similarity [BinCola2024], adapted for classification by sampling assembly instruction token random walks to produce PV-DM document embeddings (d = 128), connected to a supervised 2-layer MLP classification head trained via cross-entropy.</w:t>
+      </w:r>
+    </w:p>
+    <w:p>
+      <w:r>
+        <w:t>All models were trained on the identical 7,000 training partition binaries, validated on the 1,500 validation binaries, and evaluated at decision threshold \theta = 0.50 on the identical 1,500 held-out test partition tensors.</w:t>
       </w:r>
     </w:p>
     <w:p>
@@ -857,7 +862,12 @@
     </w:p>
     <w:p>
       <w:r>
-        <w:t>To assess stability across simulated longitudinal acquisition periods, the test cohort was partitioned into four chronological windows of 375 samples each. Empirical test accuracies remained stable across partitions: 99.47% (Window 1), 100.00% (Window 2), 99.73% (Window 3), and 99.73% (Window 4), yielding a minimal observed F1 shift of \Delta\text{F1} = -0.0028. Crucially, as disclosed in Section sec:validity, these chronological timestamps were assigned based on catalog simulation metadata rather than longitudinal real-world deployment telemetry. Consequently, these results must be interpreted as a simulated chronological partition evaluation rather than genuine multi-year prospective temporal drift validation.</w:t>
+        <w:t>To assess stability across simulated longitudinal acquisition periods, the test cohort was partitioned into four chronological windows of 375 samples each. Empirical test accuracies remained stable across partitions: 99.47% (Window 1), 100.00% (Window 2), 99.73% (Window 3), and 99.73% (Window 4), yielding a minimal observed F1 shift of \Delta\text{F1} = -0.0028 (Table tab:temporal_evaluation). Crucially, as disclosed in Section sec:validity, these chronological timestamps were assigned based on catalog simulation metadata rather than longitudinal real-world deployment telemetry. Consequently, these results must be interpreted as a simulated chronological partition evaluation rather than genuine multi-year prospective temporal drift validation.</w:t>
+      </w:r>
+    </w:p>
+    <w:p>
+      <w:r>
+        <w:t>[TABLE INSERTED HERE]</w:t>
       </w:r>
     </w:p>
     <w:p>

</xml_diff>

<commit_message>
fix(ISSUE-12): restrict WannaCry evaluation claim to single-family holdout and verify SHA-256 hash disjointness
</commit_message>
<xml_diff>
--- a/manuscript/revised/FINAL_REVISED_MANUSCRIPT.docx
+++ b/manuscript/revised/FINAL_REVISED_MANUSCRIPT.docx
@@ -677,7 +677,7 @@
         <w:br/>
         <w:t xml:space="preserve">    • Class Balance: The training cohort comprises exactly 3,500 benign and 3,500 malware binaries (50.00% : 50.00% balance). The held-out test split comprises 756 benign and 744 malware binaries (50.40% : 49.60%).</w:t>
         <w:br/>
-        <w:t xml:space="preserve">    • Family-Level Distribution and Leakage Analysis: While strict cryptographic SHA-256 deduplication guarantees that no binary executable appears in more than one partition, in-distribution test binaries inevitably share common malware family lineages (e.g., Emotet, TrickBot, AgentTesla) with the training cohort. While standard in randomized stratified benchmarks, this allows neural models to potentially leverage family-specific compiler idioms. To explicitly audit model behavior when family-level lineage is completely withheld, we deliberately supplement the random test partition with a dedicated single-family sample holdout protocol (Section sec:generalization), completely withholding all 157 binaries of ransomware_wannacry during training.</w:t>
+        <w:t xml:space="preserve">    • Family-Level Distribution and Leakage Analysis: Strict cryptographic SHA-256 deduplication guarantees that no binary executable appears in more than one partition (\text{Train} \cap \text{Val} = \emptyset, \text{Train} \cap \text{Test} = \emptyset, \text{Val} \cap \text{Test} = \emptyset). In addition to overall test metrics, we conduct a dedicated single-family holdout evaluation on the 157 held-out test binaries belonging to the ransomware_wannacry lineage (Section sec:generalization), verifying that the 157 test binaries are strictly disjoint by hash from the training cohort and evaluating family-specific recall and confidence calibration.</w:t>
       </w:r>
     </w:p>
     <w:p>
@@ -843,7 +843,12 @@
     </w:p>
     <w:p>
       <w:r>
-        <w:t>To evaluate sensitivity to malware variants whose specific strain was completely withheld from training, all 157 binaries belonging to the ransomware_wannacry family were excluded from the training and validation cohorts and evaluated strictly at test inference. The tri-modal model achieved 100.00% recall (157 of 157 detected) with a mean classification confidence score of 0.9297 (Fig. fig:wannacry_holdout). While this demonstrates robust variant detection within a held-out ransomware strain, we explicitly note that shared inductive priors (e.g., cryptographic API calls and packer runtime routines shared across other ransomware strains in the training set) facilitate classification. Therefore, this result reflects a single-family sample holdout rather than universal zero-day generalization.</w:t>
+        <w:t>To evaluate sensitivity to malware variants within specific families, a targeted single-family holdout evaluation was conducted on the 157 held-out test binaries belonging to the ransomware_wannacry family lineage (Table tab:family_holdout). All 157 test instances represent strictly unique SHA-256 hashes disjoint from the training and validation partitions. The tri-modal architecture achieved 100.00% recall (157 of 157 detected, 0 false negatives) with a mean classification confidence score of 0.9297 (Fig. fig:wannacry_holdout). We explicitly note that shared inductive priors (e.g., cryptographic API sequences, file encryption loops, and compiler runtime routines shared across ransomware and other malware families in the training corpus) facilitate classification. Therefore, this evaluation demonstrates robust variant detection on a single-family test cohort rather than universal zero-day generalization against unprecedented exploit mechanics.</w:t>
+      </w:r>
+    </w:p>
+    <w:p>
+      <w:r>
+        <w:t>[TABLE INSERTED HERE]</w:t>
       </w:r>
     </w:p>
     <w:p>
@@ -1016,7 +1021,7 @@
         <w:br/>
         <w:t xml:space="preserve">    • Simulated Chronological Partitions: Chronological timestamps were assigned based on catalog simulation metadata rather than longitudinal real-world telemetry; prospective temporal drift under evolving malware ecologies remains unmeasured.</w:t>
         <w:br/>
-        <w:t xml:space="preserve">    • Single-Family Holdout Constraint: The 157-sample WannaCry evaluation tests variant detection when a specific strain is withheld from training. However, shared cryptographic routines and compiler runtimes across other training families provide inductive priors; it does not establish universal zero-day immunity.</w:t>
+        <w:t xml:space="preserve">    • Single-Family Holdout Constraint: The 157-sample WannaCry evaluation tests variant detection on unseen instances within a specific family lineage under strict SHA-256 hash disjointness. However, shared cryptographic routines, compiler runtimes, and common malware behavioral primitives across training families provide strong inductive priors; this must not be construed as universal zero-day immunity against entirely novel exploit mechanisms.</w:t>
         <w:br/>
         <w:t xml:space="preserve">    • External Validity: Generalization to non-PE formats (ELF, Mach-O) requires intermediate IR compilation.</w:t>
       </w:r>

</xml_diff>

<commit_message>
fix(ISSUE-15): structure six-tier data and code availability architecture and disclaim raw malware redistribution
</commit_message>
<xml_diff>
--- a/manuscript/revised/FINAL_REVISED_MANUSCRIPT.docx
+++ b/manuscript/revised/FINAL_REVISED_MANUSCRIPT.docx
@@ -1099,7 +1099,22 @@
     </w:p>
     <w:p>
       <w:r>
-        <w:t>The complete code repository, model checkpoints, tensor shards, and automated test suite are openly available at \url{https://github.com/kohlirupesh19/Multi-Model.git} on the dedicated publication-validation branch. The repository provides scripts and artifacts for reproducing the reported experiments (bash reproduce_all.sh or python3 reproduce_all.py). Dedicated verification audit ledgers and raw evaluation artifacts are provided in the repository's reports/ and results/verified/ directories.</w:t>
+        <w:t>To ensure complete scientific reproducibility while adhering to legal and security containment guidelines for weaponizable software artifacts, repository availability is structured across six distinct tiers:</w:t>
+      </w:r>
+    </w:p>
+    <w:p>
+      <w:r>
+        <w:t>• Raw Executable Binaries (Restricted): In strict compliance with security containment policies, legal distribution liability, and hosting terms of service, live executable malware binaries cannot be redistributed directly. Researchers may reconstruct the raw binary corpus from primary archival repositories (VirusShare, VX-Underground) using the provided cryptographic SHA-256 catalog manifests.</w:t>
+        <w:br/>
+        <w:t xml:space="preserve">    • Catalog Manifests (Publicly Available): The complete 100,000-binary catalog manifest is available at datasets/benchmark_100k/dataset_manifest.jsonl, detailing SHA-256 hashes, ground-truth family labels, file sizes, compile timestamps, and repository provenance.</w:t>
+        <w:br/>
+        <w:t xml:space="preserve">    • Derived Datasets and Partitions (Publicly Available): Exactly 10,000 pre-processed multimodal instances partitioned across 10 deterministic shards (shard_000.pt to shard_009.pt) and deterministic evaluation splits (train_split.pt [7,000], val_split.pt [1,500], and test_split.pt [1,500]) are provided in the datasets/ directory.</w:t>
+        <w:br/>
+        <w:t xml:space="preserve">    • Feature Tensors and Cache Registry (Publicly Available): Serialized PyTorch tensor representations for static opcode streams, normalized control-flow graphs, and dynamic system call sequences are accessible in features_cache/tensors/, indexed via SQLite database (features_cache/features_index.sqlite).</w:t>
+        <w:br/>
+        <w:t xml:space="preserve">    • Trained Model Checkpoints (Publicly Available): Optimal trained PyTorch model weights (checkpoints/best_model.pt), hyperparameter manifests (model_manifest.json), and epoch-by-epoch convergence histories (training_history.json) are fully open-access.</w:t>
+        <w:br/>
+        <w:t xml:space="preserve">    • Replication Scripts and Test Suites (Publicly Available): The complete software implementation, end-to-end master replication pipeline (reproduce_all.sh and reproduce_all.py), and 54 automated pytest unit tests are hosted at \url{https://github.com/kohlirupesh19/Multi-Model.git} (branch publication-remediation).</w:t>
       </w:r>
     </w:p>
     <w:p>
@@ -1122,7 +1137,7 @@
         <w:br/>
         <w:t xml:space="preserve">Conflict of Interest: The authors declare that they have no conflict of interest.  </w:t>
         <w:br/>
-        <w:t xml:space="preserve">Data Availability Statement: All derived benchmark manifests, pre-computed feature shards, checkpoints, and evaluation scripts are available in the public repository. Due to security containment policies and third-party licensing constraints, raw executable binaries cannot be redistributed directly; they must be acquired from their primary archival repositories (VirusShare, VX-Underground) using the provided SHA-256 catalog manifests.  </w:t>
+        <w:t xml:space="preserve">Data Availability Statement: All derived benchmark manifests, pre-computed feature shards, serialized evaluation tensors, model checkpoints, and replication scripts are publicly accessible in the project repository (\url{https://github.com/kohlirupesh19/Multi-Model.git}). In accordance with responsible disclosure and security containment policies, raw live malware executables are not redistributed; they are uniquely indexed via cryptographic SHA-256 hashes for authorized acquisition from their original archival repositories (VirusShare, VX-Underground).  </w:t>
         <w:br/>
         <w:t xml:space="preserve">Authors' Contributions: All authors contributed to study conceptualization, architecture design, formal PRISMA review, software implementation, benchmarking, and manuscript preparation.  </w:t>
         <w:br/>

</xml_diff>

<commit_message>
fix(audit): resolve ISSUE-16 mathematical notation and PyTorch operation parity
</commit_message>
<xml_diff>
--- a/manuscript/revised/FINAL_REVISED_MANUSCRIPT.docx
+++ b/manuscript/revised/FINAL_REVISED_MANUSCRIPT.docx
@@ -501,7 +501,7 @@
     </w:p>
     <w:p>
       <w:r>
-        <w:t>where \epsilon^{(k)} is a learnable scalar. Graph-level pooling aggregates node embeddings:</w:t>
+        <w:t>where \epsilon^{(k)} is a learnable scalar. Graph-level multi-scale readout concatenates global mean and max pooled node embeddings across basic blocks:</w:t>
       </w:r>
     </w:p>
     <w:p>
@@ -603,7 +603,7 @@
     </w:p>
     <w:p>
       <w:r>
-        <w:t>Since all embeddings have unit norm (\mathbf{G}_{ii} = 1), the determinant \det(\mathbf{G}) corresponds to the squared volume of the parallelotope spanned by \{\mathbf{z}_{\text{op}}, \mathbf{z}_{\text{cfg}}, \mathbf{z}_{\text{sys}}\} in \mathbb{R}^{d}. If the modalities collapse to collinearity, \det(\mathbf{G}) \to 0. The Volumetric GRAM loss with numerical stabilizer \epsilon = 10^{-4} penalizes rank deficiency:</w:t>
+        <w:t>Since all embeddings have unit norm (\mathbf{G}_{ii} = 1), the Gramian determinant \det(\mathbf{G}) quantifies the squared volume of the parallelotope spanned by \{\mathbf{z}_{\text{op}}, \mathbf{z}_{\text{cfg}}, \mathbf{z}_{\text{sys}}\} in \mathbb{R}^{d}. For true multimodal triplets of binary i \in \mathcal{B}, representations are regularized towards a compact shared manifold by minimizing the positive Gramian volume \det(\mathbf{G}_i^+ + \epsilon \mathbf{I}_3), while cross-sample negative triplets \mathbf{G}_i^- are regularized to preserve semantic volumetric dispersion. With numerical stabilizer \epsilon = 10^{-4} and separation weight \lambda_{\text{sep}} = 0.10, the Volumetric GRAM loss is formulated as:</w:t>
       </w:r>
     </w:p>
     <w:p>

</xml_diff>

<commit_message>
fix(audit): resolve ISSUE-17 cross-section numerical consistency with zero-tolerance audit
</commit_message>
<xml_diff>
--- a/manuscript/revised/FINAL_REVISED_MANUSCRIPT.docx
+++ b/manuscript/revised/FINAL_REVISED_MANUSCRIPT.docx
@@ -195,7 +195,7 @@
     </w:p>
     <w:p>
       <w:r>
-        <w:t>• Systematic Evidence Synthesis: A PRISMA 2020 systematic review synthesizing multimodal binary similarity analysis literature across five bibliographic/publisher databases and indexing platforms (n = 842 initial records, 15 included peer-reviewed journal benchmark studies comprising 13 primary empirical investigations and 2 benchmark synthesis reviews, inter-rater reliability \kappa = 0.88), categorizing methodological strengths, risk of bias, and reporting gaps.</w:t>
+        <w:t>• Systematic Evidence Synthesis: A PRISMA 2020 systematic review synthesizing multimodal binary similarity analysis literature across five bibliographic/publisher databases and indexing platforms (n = 842 initial records, 15 included peer-reviewed journal benchmark studies comprising 13 primary empirical investigations and 2 benchmark synthesis reviews, inter-rater reliability \kappa = 0.84), categorizing methodological strengths, risk of bias, and reporting gaps.</w:t>
         <w:br/>
         <w:t xml:space="preserve">    • Reproducible Tri-Modal Architecture: A unified deep learning architecture integrating Opcode Transformers, Control Flow Graph GIN encoders, and dynamic Syscall Bi-LSTMs, regularized through pairwise InfoNCE contrastive alignment and Volumetric Gramian (GRAM) non-orthogonality loss to mitigate asynchronous channel collapse.</w:t>
         <w:br/>
@@ -647,7 +647,7 @@
     </w:p>
     <w:p>
       <w:r>
-        <w:t>with hyperparameters \lambda_{\text{align}} = 0.10 and \lambda_{\text{GRAM}} = 0.05.</w:t>
+        <w:t>with Volumetric GRAM regularizer weight \gamma = 0.50 and separation margin \lambda_{\text{sep}} = 0.10.</w:t>
       </w:r>
     </w:p>
     <w:p>
@@ -944,7 +944,7 @@
     </w:p>
     <w:p>
       <w:r>
-        <w:t>As demonstrated in Table tab:end_to_end_latency, isolated neural forward execution requires 28.87 ms for the tri-modal architecture (34.6 samples/sec) and 17.53 ms for Stage 1 fast static triage (57.0 samples/sec) (Fig. fig:latency_triage). However, complete binary ingestion requires PE parsing (1.20 ms), disassembly (12.40 ms), and CFG generation (45.60 ms), yielding an end-to-end static path latency of 76.90 ms. In stark contrast, full dynamic behavioral analysis requires guest-VM provisioning and execution timeouts ranging from 30 to 120 seconds (30,000\text{--}120,000 ms) per binary. The proposed operational triage mechanism bridges this gap: by resolving 86.2% of binaries exclusively through the 76.90 ms static path with 99.23% accuracy, it prevents dynamic sandbox queue exhaustion, routing only the 13.8% ambiguous samples to VM detonation.</w:t>
+        <w:t>As demonstrated in Table tab:end_to_end_latency, isolated neural forward execution requires 28.87 ms for the tri-modal architecture (34.6 samples/sec) and 17.53 ms for Stage 1 fast static triage (57.0 samples/sec) (Fig. fig:latency_triage). However, complete binary ingestion requires PE parsing (1.20 ms), disassembly (12.40 ms), and CFG generation (45.60 ms), yielding an end-to-end static path latency of 76.90 ms. Parameter profiling confirms the lightweight footprint of the architecture: the full tri-modal model comprises exactly 537{,}090 parameters (2.15 MB memory footprint in 32-bit floating point), distributed across the Opcode Transformer (394{,}240 parameters, 1.58 MB), CFG-GIN (26{,}880 parameters, 0.11 MB), Syscall Bi-LSTM (99{,}328 parameters, 0.40 MB), and Attention Fusion Head (16{,}642 parameters, 0.07 MB). This compact footprint explains the sub-30 ms CPU forward execution without requiring specialized GPU acceleration. In stark contrast, full dynamic behavioral analysis requires guest-VM provisioning and execution timeouts ranging from 30 to 120 seconds (30,000\text{--}120,000 ms) per binary. The proposed operational triage mechanism bridges this gap: by resolving 86.2% of binaries exclusively through the 76.90 ms static path with 99.23% accuracy, it prevents dynamic sandbox queue exhaustion, routing only the 13.8% ambiguous samples to VM detonation.</w:t>
       </w:r>
     </w:p>
     <w:p>

</xml_diff>